<commit_message>
paper: Fig. 7 EN din date canonice (script v2), v3 final
Scriptul v2 livrat (make_figures_c1_en.py): _opt_float + garda p95-gol-doar-la-loss==100,
marcaj rosu received=0 in fig_rtt_p95, PAYLOAD_LOSS canonic (diff de garda = exact cele 4
modificari permise). Blocajul fig_rtt_p95 REZOLVAT (HIL zenoh lat200_l15 received=0, loss==100).
Swap image7 in v3: word/media/image7.png <- fig_rtt_p95_en.png; rId23 wp:extent+a:ext
cy 1701800->2275550 (cx=3063240); sters TODO rosu "Fig.7 provizorie". Verificat: image7
pixel-identic, PDF pag.4 OK (received=0 rosu la lat200_l15, fara bara), text v3 intact.
Backup: Draft_..._v3_pre-image7.docx.
2g (parcat, NU in docx): fig_cdf_lat200_jit50_en.png din probe canonice per-esantion
(HIL cdds 4216 / zenoh 184; rtt_samples.csv in scratchpad, per-esantion NU in git per sec.5).

Co-Authored-By: Claude Opus 4.8 <noreply@anthropic.com>
</commit_message>
<xml_diff>
--- a/c1_benchmark/paper/Draft_Articol_C1_2coloane_v3.docx
+++ b/c1_benchmark/paper/Draft_Articol_C1_2coloane_v3.docx
@@ -4405,7 +4405,7 @@
         <w:rPr/>
         <w:drawing>
           <wp:inline distT="0" distB="0" distL="0" distR="0">
-            <wp:extent cx="3063240" cy="1701800"/>
+            <wp:extent cx="3063240" cy="2275550"/>
             <wp:effectExtent l="0" t="0" r="0" b="0"/>
             <wp:docPr id="13" name="FigRttP95" descr=""/>
             <wp:cNvGraphicFramePr>
@@ -4429,7 +4429,7 @@
                   <pic:spPr bwMode="auto">
                     <a:xfrm>
                       <a:off x="0" y="0"/>
-                      <a:ext cx="3063240" cy="1701800"/>
+                      <a:ext cx="3063240" cy="2275550"/>
                     </a:xfrm>
                     <a:prstGeom prst="rect">
                       <a:avLst/>
@@ -4459,26 +4459,6 @@
           <w:szCs w:val="15"/>
         </w:rPr>
         <w:t>Fig. 7. Per-condition p95 RTT on HIL Wi-Fi (log scale, 4 KB payload, N=5); received=0 marked where no samples returned.</w:t>
-      </w:r>
-    </w:p>
-    <w:p>
-      <w:pPr>
-        <w:pStyle w:val="Normal"/>
-        <w:shd w:val="clear" w:color="auto" w:fill="FCE4E4"/>
-        <w:spacing w:lineRule="exact" w:line="240" w:before="0" w:after="100"/>
-        <w:jc w:val="left"/>
-        <w:rPr/>
-      </w:pPr>
-      <w:r>
-        <w:rPr>
-          <w:rFonts w:eastAsia="Times New Roman" w:cs="Times New Roman"/>
-          <w:b/>
-          <w:bCs/>
-          <w:color w:val="B00000"/>
-          <w:sz w:val="16"/>
-          <w:szCs w:val="16"/>
-        </w:rPr>
-        <w:t>[TODO ALEXANDRU: Fig. 7 este provizorie (etichete in romana, direct din campanie); regenereaz-o in engleza local cu make_figures_c1_en.py --summary-csv pe datele canonice, apoi inlocuieste imaginea.]</w:t>
       </w:r>
     </w:p>
     <w:p>

</xml_diff>